<commit_message>
Update: New corrected CV
</commit_message>
<xml_diff>
--- a/public/image/Resume.docx
+++ b/public/image/Resume.docx
@@ -78,6 +78,21 @@
         </w:rPr>
         <w:t>|</w:t>
       </w:r>
+      <w:r>
+        <w:rPr>
+          <w:spacing w:val="-10"/>
+        </w:rPr>
+        <w:t xml:space="preserve"> </w:t>
+      </w:r>
+      <w:hyperlink r:id="rId7" w:history="1">
+        <w:r>
+          <w:rPr>
+            <w:rStyle w:val="Hyperlink"/>
+            <w:spacing w:val="-10"/>
+          </w:rPr>
+          <w:t>https://dln-three.vercel.app/</w:t>
+        </w:r>
+      </w:hyperlink>
       <w:r>
         <w:rPr>
           <w:spacing w:val="-10"/>
@@ -1283,7 +1298,7 @@
         </w:rPr>
         <w:t xml:space="preserve"> </w:t>
       </w:r>
-      <w:hyperlink r:id="rId7" w:history="1">
+      <w:hyperlink r:id="rId8" w:history="1">
         <w:r>
           <w:rPr>
             <w:rStyle w:val="Hyperlink"/>
@@ -1653,7 +1668,7 @@
         </w:rPr>
         <w:t xml:space="preserve"> </w:t>
       </w:r>
-      <w:hyperlink r:id="rId8" w:history="1">
+      <w:hyperlink r:id="rId9" w:history="1">
         <w:r>
           <w:rPr>
             <w:rStyle w:val="Hyperlink"/>
@@ -1816,7 +1831,7 @@
         </w:rPr>
         <w:t xml:space="preserve"> </w:t>
       </w:r>
-      <w:hyperlink r:id="rId9" w:history="1">
+      <w:hyperlink r:id="rId10" w:history="1">
         <w:r>
           <w:rPr>
             <w:rStyle w:val="Hyperlink"/>

</xml_diff>